<commit_message>
Remove old run artifacts & add neuroevolution diagram
Delete large result artifacts from multiple 20251125 runs (models, figures, metrics tables, JSON summaries, PDFs) to clean up repository size; remove .github/copilot-instructions.md. Add design assets for the audio neuroevolution algorithm (best_audio_neuroevolution_algorithm.drawio and PNG) and a new test.ipynb. Update Documents/Article.docx (binary change).
</commit_message>
<xml_diff>
--- a/Documents/Article.docx
+++ b/Documents/Article.docx
@@ -34,35 +34,122 @@
       </w:r>
     </w:p>
     <w:p>
-      <w:r>
-        <w:t xml:space="preserve">Parkinson disease </w:t>
-      </w:r>
-      <w:r>
-        <w:t>affects</w:t>
-      </w:r>
-      <w:r>
-        <w:t xml:space="preserve"> 2-3% of the population over 65 years old, and its detection is a complicated task, even more if trying early detection. Most of the diagnosis are based on subjective clinical assessments that can take from months to years. </w:t>
-      </w:r>
-      <w:r>
-        <w:br/>
-      </w:r>
-      <w:r>
-        <w:br/>
-      </w:r>
-      <w:r>
-        <w:t>Through last decades, too many studies have focused on developing algorithms that can detect and progress tracking of Parkinson disease from voice-related characteristics, using speech disturbances associated with Hypokinetic dysarthria, common in Parkinson diseases patients.</w:t>
+      <w:pPr>
+        <w:rPr>
+          <w:lang w:val="es-ES"/>
+        </w:rPr>
+      </w:pPr>
+      <w:r>
+        <w:rPr>
+          <w:lang w:val="es-ES"/>
+        </w:rPr>
+        <w:t>La enfermedad de Parkinson afe</w:t>
+      </w:r>
+      <w:r>
+        <w:rPr>
+          <w:lang w:val="es-ES"/>
+        </w:rPr>
+        <w:t>cta al 2-3% de la población mundial</w:t>
+      </w:r>
+      <w:r>
+        <w:rPr>
+          <w:lang w:val="es-ES"/>
+        </w:rPr>
+        <w:t xml:space="preserve"> en la tercera edad</w:t>
+      </w:r>
+      <w:r>
+        <w:rPr>
+          <w:lang w:val="es-ES"/>
+        </w:rPr>
+        <w:t xml:space="preserve">, y su detección temprana es crucial para mejorar la calidad de vida de los afectados. </w:t>
+      </w:r>
+      <w:r>
+        <w:rPr>
+          <w:lang w:val="es-ES"/>
+        </w:rPr>
+        <w:t>El análisis del audio de estas personas ha</w:t>
+      </w:r>
+      <w:r>
+        <w:rPr>
+          <w:lang w:val="es-ES"/>
+        </w:rPr>
+        <w:t xml:space="preserve"> supuesto un método prometedor no invasivo para la detección de esta enfermedad. </w:t>
       </w:r>
     </w:p>
-    <w:p/>
     <w:p>
-      <w:r>
-        <w:t>Also, in AI’s world, have been starting to be developed new algorithms to automate the topologies search</w:t>
+      <w:pPr>
+        <w:rPr>
+          <w:lang w:val="es-ES"/>
+        </w:rPr>
+      </w:pPr>
+      <w:r>
+        <w:rPr>
+          <w:lang w:val="es-ES"/>
+        </w:rPr>
+        <w:t xml:space="preserve">En este artículo se presenta un sistema de </w:t>
+      </w:r>
+      <w:r>
+        <w:rPr>
+          <w:lang w:val="es-ES"/>
+        </w:rPr>
+        <w:t>neuro evolución</w:t>
+      </w:r>
+      <w:r>
+        <w:rPr>
+          <w:lang w:val="es-ES"/>
+        </w:rPr>
+        <w:t xml:space="preserve"> </w:t>
+      </w:r>
+      <w:r>
+        <w:rPr>
+          <w:lang w:val="es-ES"/>
+        </w:rPr>
+        <w:t>hibridad</w:t>
+      </w:r>
+      <w:r>
+        <w:rPr>
+          <w:lang w:val="es-ES"/>
+        </w:rPr>
+        <w:t xml:space="preserve"> capaz de diseñar autónomamente redes neuronales convolucionales </w:t>
+      </w:r>
+      <w:r>
+        <w:rPr>
+          <w:lang w:val="es-ES"/>
+        </w:rPr>
+        <w:t>unidimensionales</w:t>
+      </w:r>
+      <w:r>
+        <w:rPr>
+          <w:lang w:val="es-ES"/>
+        </w:rPr>
+        <w:t xml:space="preserve"> (1D-CNN) optimizada para clasificar las grabaciones de audio de la voz de personas con y sin patologías con un dataset que ha sido aumentado mediante GANs que han generado más muestres a partir de las reales. </w:t>
+      </w:r>
+      <w:r>
+        <w:rPr>
+          <w:lang w:val="es-ES"/>
+        </w:rPr>
+        <w:t xml:space="preserve">Este sistema combina algoritmos genéticos con tasa de mutación adaptativa, validación cruzada con </w:t>
+      </w:r>
+      <w:proofErr w:type="spellStart"/>
+      <w:r>
+        <w:rPr>
+          <w:lang w:val="es-ES"/>
+        </w:rPr>
+        <w:t>fold</w:t>
+      </w:r>
+      <w:proofErr w:type="spellEnd"/>
+      <w:r>
+        <w:rPr>
+          <w:lang w:val="es-ES"/>
+        </w:rPr>
+        <w:t xml:space="preserve"> 5, realizado en paralelo, y uso de datos sintéticos. Los resultados preliminares muestran una precisión media del 75% con una sensibilidad de 84,98%. </w:t>
       </w:r>
     </w:p>
-    <w:p/>
     <w:p>
       <w:pPr>
-        <w:pStyle w:val="Ttulo"/>
+        <w:rPr>
+          <w:lang w:val="es-ES"/>
+        </w:rPr>
       </w:pPr>
     </w:p>
     <w:p>
@@ -184,11 +271,9 @@
       <w:r>
         <w:t xml:space="preserve"> [3] was designed as a cloud system that allow to the </w:t>
       </w:r>
-      <w:proofErr w:type="gramStart"/>
-      <w:r>
-        <w:t>users</w:t>
-      </w:r>
-      <w:proofErr w:type="gramEnd"/>
+      <w:r>
+        <w:t>user’s</w:t>
+      </w:r>
       <w:r>
         <w:t xml:space="preserve"> design and train neuronal networks</w:t>
       </w:r>
@@ -199,6 +284,8 @@
         <w:t>sing evolutionary algorithms and particle algorithms. This allows the best classifier to be downloaded and implemented in Python, Java, and JavaScript. In addition, it takes advantage of GPU parallelization to improve performance in the mutation, crossover, and evaluation phases.</w:t>
       </w:r>
     </w:p>
+    <w:p/>
+    <w:p/>
     <w:p>
       <w:pPr>
         <w:pStyle w:val="Ttulo1"/>
@@ -238,7 +325,6 @@
           <w:rFonts w:ascii="Times New Roman"/>
           <w:sz w:val="20"/>
         </w:rPr>
-        <w:lastRenderedPageBreak/>
         <w:t>Stanley,</w:t>
       </w:r>
       <w:r>
@@ -436,6 +522,7 @@
           <w:i/>
           <w:sz w:val="20"/>
         </w:rPr>
+        <w:lastRenderedPageBreak/>
         <w:t>Evolutionary</w:t>
       </w:r>
       <w:r>
@@ -608,23 +695,6 @@
         <w:t>Algorythms</w:t>
       </w:r>
       <w:proofErr w:type="spellEnd"/>
-    </w:p>
-    <w:p>
-      <w:pPr>
-        <w:pStyle w:val="Prrafodelista"/>
-        <w:numPr>
-          <w:ilvl w:val="0"/>
-          <w:numId w:val="10"/>
-        </w:numPr>
-        <w:tabs>
-          <w:tab w:val="left" w:pos="883"/>
-        </w:tabs>
-        <w:spacing w:before="17" w:line="274" w:lineRule="exact"/>
-        <w:rPr>
-          <w:rFonts w:ascii="Times New Roman"/>
-          <w:sz w:val="20"/>
-        </w:rPr>
-      </w:pPr>
     </w:p>
     <w:p/>
     <w:sectPr>

</xml_diff>